<commit_message>
Memo: even spacing in 4a, aligned c-e, compact table, keep signature with paragraph 5
Co-Authored-By: Claude Opus 5.5 <noreply@anthropic.com>
Claude-Session: https://claude.ai/code/session_01HUa9sxRc7o7bsnuzSz3H5S
</commit_message>
<xml_diff>
--- a/application/Pezan_DXDT_Application_Memo.docx
+++ b/application/Pezan_DXDT_Application_Memo.docx
@@ -136,7 +136,7 @@
           <v:shape id="_x0000_i1025" type="#_x0000_t75" style="width:71.5pt;height:71.5pt" o:ole="" fillcolor="window">
             <v:imagedata r:id="rId11" o:title=""/>
           </v:shape>
-          <o:OLEObject Type="Embed" ProgID="Word.Picture.8" ShapeID="_x0000_i1025" DrawAspect="Content" ObjectID="_1853644175" r:id="rId12"/>
+          <o:OLEObject Type="Embed" ProgID="Word.Picture.8" ShapeID="_x0000_i1025" DrawAspect="Content" ObjectID="_1853645932" r:id="rId12"/>
         </w:object>
       </w:r>
     </w:p>
@@ -300,7 +300,7 @@
           <w:sz w:val="24"/>
           <w:szCs w:val="24"/>
         </w:rPr>
-        <w:t xml:space="preserve">1.  Long-term Professional Goals.  I intend to serve as an Army officer who turns operational problems into rigorous models and fielded software. I plan to commission as an Infantry officer and lead Soldiers first, because I believe many crucial problems start within formations. As an Operations Research major with a minor in artificial intelligence and a finance specialization, I then want to build toward service as an Operations Research/Systems Analyst (FA49) or work with AI through the Army AI Integration Center (AI2C) or the GenAI Task Force. Additionally, I plan to earn a graduate degree, such as an MBA or another qualifying degree, and return to West Point to teach in the Department of Mathematical Sciences, bringing current industry practice into the classroom.</w:t>
+        <w:t>1.  Long-term Professional Goals.  I intend to serve as an Army officer who turns operational problems into rigorous models and fielded software. I plan to commission as an Infantry officer and lead Soldiers first, because I believe many crucial problems start within formations. As an Operations Research major with a minor in artificial intelligence and a finance specialization, I then want to build toward service as an Operations Research/Systems Analyst (FA49) or work with AI through the Army AI Integration Center (AI2C) or the GenAI Task Force. Additionally, I plan to earn a graduate degree, such as an MBA or another qualifying degree, and return to West Point to teach in the Department of Mathematical Sciences, bringing current industry practice into the classroom.</w:t>
       </w:r>
     </w:p>
     <w:p>
@@ -313,12 +313,23 @@
           <w:szCs w:val="24"/>
         </w:rPr>
       </w:pPr>
+    </w:p>
+    <w:p>
+      <w:pPr>
+        <w:tabs>
+          <w:tab w:val="left" w:pos="4680"/>
+        </w:tabs>
+        <w:rPr>
+          <w:sz w:val="24"/>
+          <w:szCs w:val="24"/>
+        </w:rPr>
+      </w:pPr>
       <w:r>
         <w:rPr>
           <w:sz w:val="24"/>
           <w:szCs w:val="24"/>
         </w:rPr>
-        <w:t xml:space="preserve">2. Purpose. Mr. Philippone has described data as the ammunition of the future and has framed a commander’s hardest choices as constrained optimization, which means finding the best decision across competing tradeoffs fast enough to matter. This past summer I saw that idea from three angles. On the Sea to Shining Sea AIAD, Palantir’s team in Palo Alto walked us through Project Maven and how it gives commanders at every echelon a common picture to decide from. At the 4th Infantry Division, we saw how a formation employs those systems and feeds lessons back to the developers. At Stanford’s Gordian Knot Center, Col. (Ret.) Joseph Felter and Jack Faherty described how student startups get new technology into the hands of Army units, and why that is so hard.</w:t>
+        <w:t>2. Purpose. Mr. Philippone has described data as the ammunition of the future and has framed a commander’s hardest choices as constrained optimization, which means finding the best decision across competing tradeoffs fast enough to matter. This past summer I saw that idea from three angles. On the Sea to Shining Sea AIAD, Palantir’s team in Palo Alto walked us through Project Maven and how it gives commanders at every echelon a common picture to decide from. At the 4th Infantry Division, we saw how a formation employs those systems and feeds lessons back to the developers. At Stanford’s Gordian Knot Center, Col. (Ret.) Joseph Felter and Jack Faherty described how student startups get new technology into the hands of Army units, and why that is so hard.</w:t>
       </w:r>
     </w:p>
     <w:p>
@@ -393,7 +404,15 @@
           <w:sz w:val="24"/>
           <w:szCs w:val="24"/>
         </w:rPr>
-        <w:t xml:space="preserve">3. Near-term Research Goals.  My near-term goal is to complete and present my research on a transportation and logistics problem that combines reinforcement learning and network optimization on a maritime network. At TDAC I redesigned the reward function for a reinforcement-learning agent that allocates resupply in Logistics Battle Command, the Army’s sustainment simulation. I built diagnostic tools that exposed why a high-scoring agent was starving the priority unit, and the retrained agent more than tripled the share of requests filled.</w:t>
+        <w:t xml:space="preserve">3. Near-term Research Goals.  My near-term goal is to complete and present my research on a transportation and logistics problem that combines reinforcement learning and network optimization on a maritime network. At TDAC I redesigned the reward function for a reinforcement-learning agent that allocates resupply in Logistics Battle Command, the Army’s </w:t>
+      </w:r>
+      <w:r>
+        <w:rPr>
+          <w:sz w:val="24"/>
+          <w:szCs w:val="24"/>
+        </w:rPr>
+        <w:lastRenderedPageBreak/>
+        <w:t>sustainment simulation. I built diagnostic tools that exposed why a high-scoring agent was starving the priority unit, and the retrained agent more than tripled the share of requests filled.</w:t>
       </w:r>
     </w:p>
     <w:p>
@@ -515,7 +534,7 @@
           <w:sz w:val="24"/>
           <w:szCs w:val="24"/>
         </w:rPr>
-        <w:t xml:space="preserve">Funding Plan.  My plan is one AIAD, three conferences in priority order, and three online courses. I request funding for the AIAD, my first-priority conference, and the courses; the second and third conferences are alternates if a higher priority falls through.</w:t>
+        <w:t xml:space="preserve">Funding Plan.  My plan is one AIAD, three conferences in priority order, and three online courses. I request funding for the AIAD, the first-priority conference, and the courses.</w:t>
       </w:r>
     </w:p>
     <w:p>
@@ -524,7 +543,7 @@
         <w:tabs>
           <w:tab w:val="left" w:pos="4680"/>
         </w:tabs>
-        <w:spacing w:before="120"/>
+        <w:spacing w:before="80"/>
         <w:ind w:left="660"/>
         <w:contextualSpacing w:val="0"/>
         <w:rPr>
@@ -595,7 +614,7 @@
         <w:tabs>
           <w:tab w:val="left" w:pos="4680"/>
         </w:tabs>
-        <w:spacing w:before="120"/>
+        <w:spacing w:before="80"/>
         <w:ind w:left="660"/>
         <w:contextualSpacing w:val="0"/>
         <w:rPr>
@@ -617,7 +636,7 @@
         <w:tabs>
           <w:tab w:val="left" w:pos="4680"/>
         </w:tabs>
-        <w:spacing w:before="120"/>
+        <w:spacing w:before="80"/>
         <w:ind w:left="660"/>
         <w:contextualSpacing w:val="0"/>
         <w:rPr>
@@ -653,7 +672,9 @@
         <w:tabs>
           <w:tab w:val="left" w:pos="4680"/>
         </w:tabs>
+        <w:spacing w:before="80"/>
         <w:ind w:left="660"/>
+        <w:contextualSpacing w:val="0"/>
         <w:rPr>
           <w:sz w:val="24"/>
           <w:szCs w:val="24"/>
@@ -664,7 +685,7 @@
           <w:sz w:val="24"/>
           <w:szCs w:val="24"/>
         </w:rPr>
-        <w:t xml:space="preserve">Conference, Priority 3. From 16–18 March 2027, I will spend $2,000 on travel, lodging, and meals to attend the AUSA Global Force Symposium in Huntsville, AL; registration is free for military attendees. It is the Army’s annual forum on modernization, where senior leaders and industry discuss the technology, acquisition, and concepts that will shape the </w:t>
+        <w:t xml:space="preserve">Conference, Priority 3. From 16–18 March 2027, I will spend $2,000 on travel, lodging, and meals to attend the AUSA Global Force Symposium in Huntsville, AL; registration is free for military attendees. It is the Army’s annual forum on modernization, where senior </w:t>
       </w:r>
       <w:r>
         <w:rPr>
@@ -672,7 +693,7 @@
           <w:szCs w:val="24"/>
         </w:rPr>
         <w:lastRenderedPageBreak/>
-        <w:t>future force. Attending would show me which problems the Army is trying to solve and where research like mine can help.</w:t>
+        <w:t>leaders and industry discuss the technology, acquisition, and concepts that will shape the future force. Attending would show me which problems the Army is trying to solve and where research like mine can help.</w:t>
       </w:r>
     </w:p>
     <w:p>
@@ -681,7 +702,9 @@
         <w:tabs>
           <w:tab w:val="left" w:pos="4680"/>
         </w:tabs>
+        <w:spacing w:before="80"/>
         <w:ind w:left="660"/>
+        <w:contextualSpacing w:val="0"/>
         <w:rPr>
           <w:sz w:val="24"/>
           <w:szCs w:val="24"/>
@@ -692,8 +715,21 @@
           <w:sz w:val="24"/>
           <w:szCs w:val="24"/>
         </w:rPr>
-        <w:t xml:space="preserve">Online Courses. During 2027, I will spend $797 on verified certificates for three courses in the MITx Supply Chain Management MicroMasters program, offered by the MIT Center for Transportation &amp; Logistics. The courses are Supply Chain Analytics (SC0x, $199), Supply Chain Fundamentals (SC1x, $299), and Supply Chain Design (SC2x, $299). Supply Chain Design covers network design and optimization, the defender’s side of the problem my Taiwan model attacks. The courses also count toward the MicroMasters credential, a pathway to graduate study in supply chain management.</w:t>
+        <w:t>Online Courses. During 2027, I will spend $797 on verified certificates for three courses in the MITx Supply Chain Management MicroMasters program, offered by the MIT Center for Transportation &amp; Logistics. The courses are Supply Chain Analytics (SC0x, $199), Supply Chain Fundamentals (SC1x, $299), and Supply Chain Design (SC2x, $299). Supply Chain Design covers network design and optimization, the defender’s side of the problem my Taiwan model attacks. The courses also count toward the MicroMasters credential, a pathway to graduate study in supply chain management.</w:t>
       </w:r>
+    </w:p>
+    <w:p>
+      <w:pPr>
+        <w:pStyle w:val="ListParagraph"/>
+        <w:tabs>
+          <w:tab w:val="left" w:pos="4680"/>
+        </w:tabs>
+        <w:ind w:left="660"/>
+        <w:rPr>
+          <w:sz w:val="24"/>
+          <w:szCs w:val="24"/>
+        </w:rPr>
+      </w:pPr>
     </w:p>
     <w:p>
       <w:pPr>
@@ -963,7 +999,7 @@
                 <w:sz w:val="22"/>
                 <w:szCs w:val="22"/>
               </w:rPr>
-              <w:t>MIT Lincoln Laboratory (alternate, Duke University ECE)</w:t>
+              <w:t>MIT Lincoln Laboratory (alt. Duke ECE)</w:t>
             </w:r>
           </w:p>
         </w:tc>
@@ -986,7 +1022,7 @@
                 <w:sz w:val="22"/>
                 <w:szCs w:val="22"/>
               </w:rPr>
-              <w:t>Lexington, MA (alternate, Durham, NC)</w:t>
+              <w:t>Lexington, MA (alt. Durham, NC)</w:t>
             </w:r>
           </w:p>
         </w:tc>
@@ -1224,7 +1260,7 @@
                 <w:sz w:val="22"/>
                 <w:szCs w:val="22"/>
               </w:rPr>
-              <w:t>IEEE SIEDS, University of Virginia</w:t>
+              <w:t>IEEE SIEDS, UVA</w:t>
             </w:r>
           </w:p>
         </w:tc>
@@ -1436,7 +1472,6 @@
           <w:tab w:val="left" w:pos="450"/>
           <w:tab w:val="left" w:pos="4680"/>
         </w:tabs>
-        <w:ind w:left="540" w:hanging="240"/>
         <w:rPr>
           <w:sz w:val="24"/>
           <w:szCs w:val="24"/>
@@ -1447,7 +1482,7 @@
           <w:sz w:val="24"/>
           <w:szCs w:val="24"/>
         </w:rPr>
-        <w:t xml:space="preserve">Equipment, Materials, or Supplies. Three MITx course certificates purchased from MIT (learn.mit.edu), SC0x ($199), SC1x ($299), and SC2x ($299), for a total of $797.</w:t>
+        <w:t>Equipment, Materials, or Supplies. Three MITx course certificates purchased from MIT (learn.mit.edu), SC0x ($199), SC1x ($299), and SC2x ($299), for a total of $797.</w:t>
       </w:r>
     </w:p>
     <w:p>
@@ -1457,7 +1492,6 @@
           <w:tab w:val="left" w:pos="450"/>
           <w:tab w:val="left" w:pos="4680"/>
         </w:tabs>
-        <w:ind w:left="540" w:hanging="240"/>
         <w:rPr>
           <w:sz w:val="24"/>
           <w:szCs w:val="24"/>
@@ -1475,7 +1509,6 @@
           <w:tab w:val="left" w:pos="450"/>
           <w:tab w:val="left" w:pos="4680"/>
         </w:tabs>
-        <w:ind w:left="540" w:hanging="240"/>
         <w:rPr>
           <w:sz w:val="24"/>
           <w:szCs w:val="24"/>
@@ -1486,7 +1519,7 @@
           <w:sz w:val="24"/>
           <w:szCs w:val="24"/>
         </w:rPr>
-        <w:t xml:space="preserve">Total. $9,497, covering the AIAD ($6,700), the first-priority conference ($2,000), and the online courses ($797). Each alternate conference is also estimated at $2,000, so any substitution keeps the total at $9,497, within the $10,000 limit.</w:t>
+        <w:t xml:space="preserve">Total. $9,497 (AIAD $6,700, first-priority conference $2,000, online courses $797), within the $10,000 limit. Each alternate conference is also $2,000.</w:t>
       </w:r>
     </w:p>
     <w:p>
@@ -1502,7 +1535,13 @@
     </w:p>
     <w:p>
       <w:pPr>
-        <w:tabs>
+        <w:pStyle w:val="ListParagraph"/>
+        <w:numPr>
+          <w:ilvl w:val="0"/>
+          <w:numId w:val="28"/>
+        </w:numPr>
+        <w:tabs>
+          <w:tab w:val="left" w:pos="450"/>
           <w:tab w:val="left" w:pos="4680"/>
         </w:tabs>
         <w:rPr>
@@ -1515,7 +1554,7 @@
           <w:sz w:val="24"/>
           <w:szCs w:val="24"/>
         </w:rPr>
-        <w:t xml:space="preserve">     e. Timeline for Expenditures. From November 2026 to February 2027, I will request the AIAD placement, submit the SIEDS abstract, and register for the conferences. Between March and May 2027, I will attend the funded conference (dates in the table above), and I will complete the AIAD from 11–31 July 2027. I will buy each MITx certificate when that course opens, and all funds will be spent by 31 December 2027, before my graduation in May 2029.</w:t>
+        <w:t xml:space="preserve">Timeline for Expenditures. From November 2026 to February 2027, I will request the AIAD placement, submit the SIEDS abstract, and register for the conferences. I will attend the funded conference between March and May 2027 and complete the AIAD from 11–31 July 2027. I will buy each MITx certificate when that course opens, and all funds will be spent by 31 December 2027, before my May 2029 graduation.</w:t>
       </w:r>
     </w:p>
     <w:p>
@@ -1673,7 +1712,7 @@
           <w:sz w:val="24"/>
           <w:szCs w:val="24"/>
         </w:rPr>
-        <w:t xml:space="preserve">Encl</w:t>
+        <w:t>Encl</w:t>
       </w:r>
       <w:r>
         <w:rPr>
@@ -1681,13 +1720,7 @@
           <w:szCs w:val="24"/>
         </w:rPr>
         <w:tab/>
-      </w:r>
-      <w:r>
-        <w:rPr>
-          <w:sz w:val="24"/>
-          <w:szCs w:val="24"/>
-        </w:rPr>
-        <w:t xml:space="preserve">DENNIS G. PEZAN</w:t>
+        <w:t>DENNIS G. PEZAN</w:t>
       </w:r>
     </w:p>
     <w:p>
@@ -1705,7 +1738,7 @@
           <w:sz w:val="24"/>
           <w:szCs w:val="24"/>
         </w:rPr>
-        <w:t xml:space="preserve">Applicant’s Curriculum Vitae</w:t>
+        <w:t>Applicant’s Curriculum Vitae</w:t>
       </w:r>
       <w:r>
         <w:rPr>
@@ -1713,13 +1746,7 @@
           <w:szCs w:val="24"/>
         </w:rPr>
         <w:tab/>
-      </w:r>
-      <w:r>
-        <w:rPr>
-          <w:sz w:val="24"/>
-          <w:szCs w:val="24"/>
-        </w:rPr>
-        <w:t xml:space="preserve">CDT, USCC</w:t>
+        <w:t>CDT, USCC</w:t>
       </w:r>
     </w:p>
     <w:p>
@@ -1738,13 +1765,7 @@
           <w:szCs w:val="24"/>
         </w:rPr>
         <w:tab/>
-      </w:r>
-      <w:r>
-        <w:rPr>
-          <w:sz w:val="24"/>
-          <w:szCs w:val="24"/>
-        </w:rPr>
-        <w:t xml:space="preserve">Team Leader, Company C-2</w:t>
+        <w:t>Team Leader, Company C-2</w:t>
       </w:r>
     </w:p>
     <w:sectPr>
@@ -5225,6 +5246,7 @@
   <w:style w:type="character" w:default="1" w:styleId="DefaultParagraphFont">
     <w:name w:val="Default Paragraph Font"/>
     <w:uiPriority w:val="1"/>
+    <w:semiHidden/>
     <w:unhideWhenUsed/>
   </w:style>
   <w:style w:type="table" w:default="1" w:styleId="TableNormal">
@@ -5827,6 +5849,15 @@
 </file>
 
 <file path=customXml/item1.xml><?xml version="1.0" encoding="utf-8"?>
+<?mso-contentType ?>
+<FormTemplates xmlns="http://schemas.microsoft.com/sharepoint/v3/contenttype/forms">
+  <Display>DocumentLibraryForm</Display>
+  <Edit>DocumentLibraryForm</Edit>
+  <New>DocumentLibraryForm</New>
+</FormTemplates>
+</file>
+
+<file path=customXml/item2.xml><?xml version="1.0" encoding="utf-8"?>
 <p:properties xmlns:p="http://schemas.microsoft.com/office/2006/metadata/properties" xmlns:xsi="http://www.w3.org/2001/XMLSchema-instance" xmlns:pc="http://schemas.microsoft.com/office/infopath/2007/PartnerControls">
   <documentManagement>
     <lcf76f155ced4ddcb4097134ff3c332f xmlns="b6c243bf-a1a9-4ba6-8da4-da0b029aa8eb">
@@ -5837,20 +5868,7 @@
 </p:properties>
 </file>
 
-<file path=customXml/item2.xml><?xml version="1.0" encoding="utf-8"?>
-<?mso-contentType ?>
-<FormTemplates xmlns="http://schemas.microsoft.com/sharepoint/v3/contenttype/forms">
-  <Display>DocumentLibraryForm</Display>
-  <Edit>DocumentLibraryForm</Edit>
-  <New>DocumentLibraryForm</New>
-</FormTemplates>
-</file>
-
 <file path=customXml/item3.xml><?xml version="1.0" encoding="utf-8"?>
-<b:Sources xmlns:b="http://schemas.openxmlformats.org/officeDocument/2006/bibliography" xmlns="http://schemas.openxmlformats.org/officeDocument/2006/bibliography" SelectedStyle="\APASixthEditionOfficeOnline.xsl" StyleName="APA" Version="6"/>
-</file>
-
-<file path=customXml/item4.xml><?xml version="1.0" encoding="utf-8"?>
 <ct:contentTypeSchema xmlns:ct="http://schemas.microsoft.com/office/2006/metadata/contentType" xmlns:ma="http://schemas.microsoft.com/office/2006/metadata/properties/metaAttributes" ct:_="" ma:_="" ma:contentTypeName="Document" ma:contentTypeID="0x0101002C90FB65EDBE924A8972BF6227142302" ma:contentTypeVersion="19" ma:contentTypeDescription="Create a new document." ma:contentTypeScope="" ma:versionID="7531c606bbac50d7f91dd9487ee3d38e">
   <xsd:schema xmlns:xsd="http://www.w3.org/2001/XMLSchema" xmlns:xs="http://www.w3.org/2001/XMLSchema" xmlns:p="http://schemas.microsoft.com/office/2006/metadata/properties" xmlns:ns2="b6c243bf-a1a9-4ba6-8da4-da0b029aa8eb" xmlns:ns3="4b0f2749-be2f-491e-8e5a-617d6ac8c552" targetNamespace="http://schemas.microsoft.com/office/2006/metadata/properties" ma:root="true" ma:fieldsID="9dd95e8467294509e291de4fb51054ff" ns2:_="" ns3:_="">
     <xsd:import namespace="b6c243bf-a1a9-4ba6-8da4-da0b029aa8eb"/>
@@ -6111,7 +6129,19 @@
 </ct:contentTypeSchema>
 </file>
 
+<file path=customXml/item4.xml><?xml version="1.0" encoding="utf-8"?>
+<b:Sources xmlns:b="http://schemas.openxmlformats.org/officeDocument/2006/bibliography" xmlns="http://schemas.openxmlformats.org/officeDocument/2006/bibliography" SelectedStyle="\APASixthEditionOfficeOnline.xsl" StyleName="APA" Version="6"/>
+</file>
+
 <file path=customXml/itemProps1.xml><?xml version="1.0" encoding="utf-8"?>
+<ds:datastoreItem xmlns:ds="http://schemas.openxmlformats.org/officeDocument/2006/customXml" ds:itemID="{978C89D2-7780-4E9D-AEC7-39D64F46D75F}">
+  <ds:schemaRefs>
+    <ds:schemaRef ds:uri="http://schemas.microsoft.com/sharepoint/v3/contenttype/forms"/>
+  </ds:schemaRefs>
+</ds:datastoreItem>
+</file>
+
+<file path=customXml/itemProps2.xml><?xml version="1.0" encoding="utf-8"?>
 <ds:datastoreItem xmlns:ds="http://schemas.openxmlformats.org/officeDocument/2006/customXml" ds:itemID="{A0AE37E5-FCCF-403F-9424-D1529FE8218C}">
   <ds:schemaRefs>
     <ds:schemaRef ds:uri="http://schemas.microsoft.com/office/2006/metadata/properties"/>
@@ -6122,23 +6152,7 @@
 </ds:datastoreItem>
 </file>
 
-<file path=customXml/itemProps2.xml><?xml version="1.0" encoding="utf-8"?>
-<ds:datastoreItem xmlns:ds="http://schemas.openxmlformats.org/officeDocument/2006/customXml" ds:itemID="{978C89D2-7780-4E9D-AEC7-39D64F46D75F}">
-  <ds:schemaRefs>
-    <ds:schemaRef ds:uri="http://schemas.microsoft.com/sharepoint/v3/contenttype/forms"/>
-  </ds:schemaRefs>
-</ds:datastoreItem>
-</file>
-
 <file path=customXml/itemProps3.xml><?xml version="1.0" encoding="utf-8"?>
-<ds:datastoreItem xmlns:ds="http://schemas.openxmlformats.org/officeDocument/2006/customXml" ds:itemID="{F2D63063-93F0-4B9D-AAEA-4663A59CF496}">
-  <ds:schemaRefs>
-    <ds:schemaRef ds:uri="http://schemas.openxmlformats.org/officeDocument/2006/bibliography"/>
-  </ds:schemaRefs>
-</ds:datastoreItem>
-</file>
-
-<file path=customXml/itemProps4.xml><?xml version="1.0" encoding="utf-8"?>
 <ds:datastoreItem xmlns:ds="http://schemas.openxmlformats.org/officeDocument/2006/customXml" ds:itemID="{CB4D324C-0A4C-4816-A153-56E19F56D8EC}">
   <ds:schemaRefs>
     <ds:schemaRef ds:uri="http://schemas.microsoft.com/office/2006/metadata/contentType"/>
@@ -6155,4 +6169,12 @@
     <ds:schemaRef ds:uri="http://schemas.microsoft.com/internal/obd"/>
   </ds:schemaRefs>
 </ds:datastoreItem>
+</file>
+
+<file path=customXml/itemProps4.xml><?xml version="1.0" encoding="utf-8"?>
+<ds:datastoreItem xmlns:ds="http://schemas.openxmlformats.org/officeDocument/2006/customXml" ds:itemID="{F2D63063-93F0-4B9D-AAEA-4663A59CF496}">
+  <ds:schemaRefs>
+    <ds:schemaRef ds:uri="http://schemas.openxmlformats.org/officeDocument/2006/bibliography"/>
+  </ds:schemaRefs>
+</ds:datastoreItem>
 </file>
</xml_diff>

<commit_message>
Apply LTC Webb's markup to memo and CV
Memo: para 3 retold from TDAC to the Taiwan project to future work; AIAD
and conference options in priority order with one merged cost per group.
CV: project-titled research entries, month dates and two-line layout for
every entry, three bullets per research entry, trimmed names and bullets.

Co-Authored-By: Claude Opus 5.5 <noreply@anthropic.com>
Claude-Session: https://claude.ai/code/session_01HUa9sxRc7o7bsnuzSz3H5S
</commit_message>
<xml_diff>
--- a/application/Pezan_DXDT_Application_Memo.docx
+++ b/application/Pezan_DXDT_Application_Memo.docx
@@ -329,7 +329,7 @@
           <w:sz w:val="24"/>
           <w:szCs w:val="24"/>
         </w:rPr>
-        <w:t>2. Purpose. Mr. Philippone has described data as the ammunition of the future and has framed a commander’s hardest choices as constrained optimization, which means finding the best decision across competing tradeoffs fast enough to matter. This past summer I saw that idea from three angles. On the Sea to Shining Sea AIAD, Palantir’s team in Palo Alto walked us through Project Maven and how it gives commanders at every echelon a common picture to decide from. At the 4th Infantry Division, we saw how a formation employs those systems and feeds lessons back to the developers. At Stanford’s Gordian Knot Center, Col. (Ret.) Joseph Felter and Jack Faherty described how student startups get new technology into the hands of Army units, and why that is so hard.</w:t>
+        <w:t xml:space="preserve">2. Purpose. Mr. Philippone has described data as the ammunition of the future and has framed a commander’s hardest choices as constrained optimization, which means finding the best decision across competing tradeoffs fast enough to matter. This past summer I saw that idea from three angles. On the Sea to Shining Sea AIAD, Palantir’s team in Palo Alto walked us through Project Maven and how it gives commanders at every echelon a common picture to decide from. At the 4th Infantry Division, we saw how a formation employs those systems and feeds lessons back to the developers. At Stanford’s Gordian Knot Center, Col. (Ret.) Joseph Felter and Jack Faherty described how student startups get new technology into the hands of Army units, and why that is so difficult.</w:t>
       </w:r>
     </w:p>
     <w:p>
@@ -358,23 +358,7 @@
           <w:sz w:val="24"/>
           <w:szCs w:val="24"/>
         </w:rPr>
-        <w:t xml:space="preserve">At my second AIAD, with the Army’s Transformation Decision Analysis Center (TDAC), I built a reinforcement-learning model for contested resupply. I am pursuing the DXDT “Velocity” Scholarship for two reasons. First, its funding would take my research out of the classroom to defense conferences where I can present it, a hackathon where I can compete, and an AIAD where I can learn how tools like it </w:t>
-      </w:r>
-      <w:proofErr w:type="gramStart"/>
-      <w:r>
-        <w:rPr>
-          <w:sz w:val="24"/>
-          <w:szCs w:val="24"/>
-        </w:rPr>
-        <w:t>are</w:t>
-      </w:r>
-      <w:proofErr w:type="gramEnd"/>
-      <w:r>
-        <w:rPr>
-          <w:sz w:val="24"/>
-          <w:szCs w:val="24"/>
-        </w:rPr>
-        <w:t xml:space="preserve"> tested before they reach a commander. Second, as a Velocity Scholar I would seek to work alongside industry partners such as Palantir, whether through an AIAD, a hackathon, or a joint research project, and bring that practice back to my research and my future formation.</w:t>
+        <w:t xml:space="preserve">At my second AIAD, with the Army’s Transformation Decision Analysis Center (TDAC), I redesigned a reinforcement-learning model for contested resupply. I am pursuing the DXDT “Velocity” Scholarship for two reasons. First, its funding would take my research out of the classroom to defense conferences where I can present it, a hackathon where I can compete, and an AIAD where I can learn how tools like it are tested before they reach a commander. Second, as a Velocity Scholar I would seek to work alongside industry partners such as Palantir, whether through an AIAD, a hackathon, or a joint research project, and bring that practice back to my research and my future formation.</w:t>
       </w:r>
     </w:p>
     <w:p>
@@ -404,15 +388,7 @@
           <w:sz w:val="24"/>
           <w:szCs w:val="24"/>
         </w:rPr>
-        <w:t xml:space="preserve">3. Near-term Research Goals.  My near-term goal is to complete and present my research on a transportation and logistics problem that combines reinforcement learning and network optimization on a maritime network. At TDAC I redesigned the reward function for a reinforcement-learning agent that allocates resupply in Logistics Battle Command, the Army’s </w:t>
-      </w:r>
-      <w:r>
-        <w:rPr>
-          <w:sz w:val="24"/>
-          <w:szCs w:val="24"/>
-        </w:rPr>
-        <w:lastRenderedPageBreak/>
-        <w:t>sustainment simulation. I built diagnostic tools that exposed why a high-scoring agent was starving the priority unit, and the retrained agent more than tripled the share of requests filled.</w:t>
+        <w:t xml:space="preserve">3. Near-term Research Goals.  My interest in contested logistics began at TDAC, where I redesigned the reward function for a reinforcement-learning agent that allocates resupply in Logistics Battle Command, the Army’s sustainment simulation. I built diagnostic tools that exposed why a high-scoring agent was starving the priority unit, and the retrained agent more than tripled the share of requests filled. That work showed me how a supply system can look successful while failing the unit that needs it most, and it left me asking the opposite question of where an adversary would strike to break one.</w:t>
       </w:r>
     </w:p>
     <w:p>
@@ -441,7 +417,7 @@
           <w:sz w:val="24"/>
           <w:szCs w:val="24"/>
         </w:rPr>
-        <w:t xml:space="preserve">This semester I am extending that work to network interdiction with my advisor, LTC Matthew Webb, whose doctoral research was in transportation and logistics. My project asks where an adversary with a fixed effort budget should act to cut Taiwan’s crude oil supply. Additionally, it tests whether LTC Webb’s reinforcement-learning attacker, trained on Ukraine’s rail network, still finds strong strategies on sea lanes. I built a 57-node, 79-edge model of Taiwan’s crude import routes from open sources, with sourced capacities and seven costed adversary actions, and verified it against an independent max-flow calculation. </w:t>
+        <w:t xml:space="preserve">That question became my current project with my advisor, LTC Matthew Webb, whose doctoral research was in transportation and logistics. My project asks where an adversary with a fixed effort budget should act to cut Taiwan’s crude oil supply. Additionally, it tests whether LTC Webb’s reinforcement-learning attacker, trained on Ukraine’s rail network, still finds strong strategies on sea lanes. I built a 57-node, 79-edge model of Taiwan’s crude import routes from open sources, with sourced capacities and seven costed adversary actions, and verified it against an independent max-flow calculation.</w:t>
       </w:r>
     </w:p>
     <w:p>
@@ -470,7 +446,7 @@
           <w:sz w:val="24"/>
           <w:szCs w:val="24"/>
         </w:rPr>
-        <w:t>Over the coming year I will (1) compare optimization baselines against the trained agent, (2) run wargaming scenarios that vary blockade and cyber costs to see how the adversary’s best plan changes, and (3) report whether a rail-trained attacker transfers to a maritime network. I will present the results at Projects Day and at the conferences in paragraph 4.</w:t>
+        <w:t xml:space="preserve">My near-term goal is to finish this study. Over the coming year I will (1) compare optimization baselines against the trained agent, (2) run wargaming scenarios that vary blockade and cyber costs to see how the adversary’s best plan changes, and (3) report whether a rail-trained attacker transfers to a maritime network. I will present the results at Projects Day and, if accepted, at SIEDS. In my remaining years at West Point, I want to extend the model from attacking a network to defending one, deciding where added capacity or protection keeps supply flowing, and develop that work into a senior thesis.</w:t>
       </w:r>
     </w:p>
     <w:p>
@@ -534,7 +510,7 @@
           <w:sz w:val="24"/>
           <w:szCs w:val="24"/>
         </w:rPr>
-        <w:t xml:space="preserve">Funding Plan.  My plan is one AIAD, three conferences in priority order, and three online courses. I request funding for the AIAD, the first-priority conference, and the courses.</w:t>
+        <w:t xml:space="preserve">Funding Plan.  I plan to attend one AIAD and one conference and to complete three online courses. I list the AIAD and conference options in priority order and will attend only one of each, so each group carries a single estimate, $6,700 for the AIAD and $2,000 for the conference.</w:t>
       </w:r>
     </w:p>
     <w:p>
@@ -556,56 +532,7 @@
           <w:sz w:val="24"/>
           <w:szCs w:val="24"/>
         </w:rPr>
-        <w:t xml:space="preserve">AIAD. From </w:t>
-      </w:r>
-      <w:r>
-        <w:rPr>
-          <w:sz w:val="24"/>
-          <w:szCs w:val="24"/>
-        </w:rPr>
-        <w:t>11</w:t>
-      </w:r>
-      <w:r>
-        <w:rPr>
-          <w:sz w:val="24"/>
-          <w:szCs w:val="24"/>
-        </w:rPr>
-        <w:t>–</w:t>
-      </w:r>
-      <w:r>
-        <w:rPr>
-          <w:sz w:val="24"/>
-          <w:szCs w:val="24"/>
-        </w:rPr>
-        <w:t>31</w:t>
-      </w:r>
-      <w:r>
-        <w:rPr>
-          <w:sz w:val="24"/>
-          <w:szCs w:val="24"/>
-        </w:rPr>
-        <w:t xml:space="preserve"> July 2027,</w:t>
-      </w:r>
-      <w:r>
-        <w:rPr>
-          <w:sz w:val="24"/>
-          <w:szCs w:val="24"/>
-        </w:rPr>
-        <w:t xml:space="preserve"> I will spend $6,700 on housing, food, and transportation for a three-week AIAD at MIT Lincoln Laboratory in Lexington, MA, a Department of Defense research center that builds and tests AI and decision-support tools for the military. At TDAC, my agent scored well while starving the priority unit, which is a testing and evaluation failure. At Lincoln Laboratory I will learn how engineers test these tools before they reach Soldiers. If a Lincoln Laboratory placement is not available, my alternate is a research AIAD at Duke University’s Department of Electrical and Computer Engineering, where LTC Patrick Kuiper earned his doctorate, at the same </w:t>
-      </w:r>
-      <w:r>
-        <w:rPr>
-          <w:sz w:val="24"/>
-          <w:szCs w:val="24"/>
-        </w:rPr>
-        <w:t xml:space="preserve">estimated </w:t>
-      </w:r>
-      <w:r>
-        <w:rPr>
-          <w:sz w:val="24"/>
-          <w:szCs w:val="24"/>
-        </w:rPr>
-        <w:t>cost.</w:t>
+        <w:t xml:space="preserve">AIAD, Primary. In summer 2027, I will spend $6,700 on housing, food, and transportation for a three-week AIAD with Palantir or Shield AI, the AIADs for which Velocity Scholars receive priority fill. Both companies build the systems that turn models like mine into decisions, Palantir through the Maven Smart System and Shield AI through its autonomy software. Working inside one would show me how and why industry is outpacing the Department of Defense in fielding AI.</w:t>
       </w:r>
     </w:p>
     <w:p>
@@ -627,7 +554,7 @@
           <w:sz w:val="24"/>
           <w:szCs w:val="24"/>
         </w:rPr>
-        <w:t xml:space="preserve">Conference, Priority 1. On 24–25 May 2027, I will spend $2,000 on train travel, lodging, and meals to attend the SCSP AI+ Expo in Washington, DC; admission is free. The Expo is the largest gathering of defense-technology companies and government AI leaders in the country, with more than 18,000 attendees. If SCSP runs its National Security Technology Hackathon again, I will enter with a team of cadets. </w:t>
+        <w:t xml:space="preserve">AIAD, Alternate 1. If neither placement is available, I will do a three-week AIAD from 11–31 July 2027 at MIT Lincoln Laboratory in Lexington, MA, a Department of Defense research center that builds and tests AI and decision-support tools for the military. At TDAC, the agent I worked on scored well while starving the priority unit, which is a testing and evaluation failure. Lincoln Laboratory is where I would learn how engineers catch failures like that before tools reach Soldiers.</w:t>
       </w:r>
     </w:p>
     <w:p>
@@ -649,21 +576,7 @@
           <w:sz w:val="24"/>
           <w:szCs w:val="24"/>
         </w:rPr>
-        <w:t xml:space="preserve">Conference, Priority 2. In </w:t>
-      </w:r>
-      <w:r>
-        <w:rPr>
-          <w:sz w:val="24"/>
-          <w:szCs w:val="24"/>
-        </w:rPr>
-        <w:t>early May 2027</w:t>
-      </w:r>
-      <w:r>
-        <w:rPr>
-          <w:sz w:val="24"/>
-          <w:szCs w:val="24"/>
-        </w:rPr>
-        <w:t>, I will spend $2,000 on travel, lodging, meals, and registration to present my Taiwan interdiction paper at the IEEE Systems and Information Engineering Design Symposium (SIEDS) at the University of Virginia, if accepted. Accepted papers are published in IEEE Xplore, which would give the project a peer-reviewed, citable result for the department.</w:t>
+        <w:t xml:space="preserve">AIAD, Alternate 2. My second alternate is a research AIAD at Duke University’s Department of Electrical and Computer Engineering, where LTC Patrick Kuiper earned his doctorate. It ranks third because it is academic research rather than work inside the defense-technology community, but it would still deepen the machine-learning skills my project depends on.</w:t>
       </w:r>
     </w:p>
     <w:p>
@@ -685,15 +598,51 @@
           <w:sz w:val="24"/>
           <w:szCs w:val="24"/>
         </w:rPr>
-        <w:t xml:space="preserve">Conference, Priority 3. From 16–18 March 2027, I will spend $2,000 on travel, lodging, and meals to attend the AUSA Global Force Symposium in Huntsville, AL; registration is free for military attendees. It is the Army’s annual forum on modernization, where senior </w:t>
+        <w:t xml:space="preserve">Conference, Primary. On 24–25 May 2027, I will spend $2,000 on train travel, lodging, and meals to attend the SCSP AI+ Expo in Washington, DC; admission is free. It ranks first because it is one of the largest gatherings of defense-technology companies and government AI leaders in the country, with more than 18,000 attendees. If SCSP runs its National Security Technology Hackathon again, I will enter with a team of cadets.</w:t>
       </w:r>
+    </w:p>
+    <w:p>
+      <w:pPr>
+        <w:pStyle w:val="ListParagraph"/>
+        <w:tabs>
+          <w:tab w:val="left" w:pos="4680"/>
+        </w:tabs>
+        <w:spacing w:before="80"/>
+        <w:ind w:left="660"/>
+        <w:contextualSpacing w:val="0"/>
+        <w:rPr>
+          <w:sz w:val="24"/>
+          <w:szCs w:val="24"/>
+        </w:rPr>
+      </w:pPr>
       <w:r>
         <w:rPr>
           <w:sz w:val="24"/>
           <w:szCs w:val="24"/>
         </w:rPr>
-        <w:lastRenderedPageBreak/>
-        <w:t>leaders and industry discuss the technology, acquisition, and concepts that will shape the future force. Attending would show me which problems the Army is trying to solve and where research like mine can help.</w:t>
+        <w:t xml:space="preserve">Conference, Alternate 1. In early May 2027, I will spend $2,000 on travel, lodging, meals, and registration to present my Taiwan interdiction paper at the IEEE Systems and Information Engineering Design Symposium (SIEDS) at the University of Virginia, if accepted. It ranks second because acceptance depends on my paper, but presenting would give the project a peer-reviewed, citable publication in IEEE Xplore.</w:t>
+      </w:r>
+    </w:p>
+    <w:p>
+      <w:pPr>
+        <w:pStyle w:val="ListParagraph"/>
+        <w:tabs>
+          <w:tab w:val="left" w:pos="4680"/>
+        </w:tabs>
+        <w:spacing w:before="80"/>
+        <w:ind w:left="660"/>
+        <w:contextualSpacing w:val="0"/>
+        <w:rPr>
+          <w:sz w:val="24"/>
+          <w:szCs w:val="24"/>
+        </w:rPr>
+      </w:pPr>
+      <w:r>
+        <w:rPr>
+          <w:sz w:val="24"/>
+          <w:szCs w:val="24"/>
+        </w:rPr>
+        <w:t xml:space="preserve">Conference, Alternate 2. From 16–18 March 2027, I will spend $2,000 on travel, lodging, and meals to attend the AUSA Global Force Symposium in Huntsville, AL; registration is free for military attendees. It is the Army’s annual forum on modernization, where senior leaders and industry discuss the technology, acquisition, and concepts that will shape the future force. It ranks third because I would attend to learn rather than to present or compete.</w:t>
       </w:r>
     </w:p>
     <w:p>
@@ -752,7 +701,7 @@
           <w:sz w:val="24"/>
           <w:szCs w:val="24"/>
         </w:rPr>
-        <w:t>Research Travel. Conferences are listed in priority order; Priorities 2 and 3 are alternates.</w:t>
+        <w:t xml:space="preserve">Research Travel. Options are listed in priority order. I will attend one AIAD and one conference, so each group has one estimated cost.</w:t>
       </w:r>
     </w:p>
     <w:p>
@@ -976,7 +925,7 @@
                 <w:sz w:val="22"/>
                 <w:szCs w:val="22"/>
               </w:rPr>
-              <w:t>AIAD</w:t>
+              <w:t xml:space="preserve">AIAD, Primary</w:t>
             </w:r>
           </w:p>
         </w:tc>
@@ -999,7 +948,7 @@
                 <w:sz w:val="22"/>
                 <w:szCs w:val="22"/>
               </w:rPr>
-              <w:t>MIT Lincoln Laboratory (alt. Duke ECE)</w:t>
+              <w:t xml:space="preserve">Palantir or Shield AI</w:t>
             </w:r>
           </w:p>
         </w:tc>
@@ -1022,7 +971,7 @@
                 <w:sz w:val="22"/>
                 <w:szCs w:val="22"/>
               </w:rPr>
-              <w:t>Lexington, MA (alt. Durham, NC)</w:t>
+              <w:t xml:space="preserve">Per placement</w:t>
             </w:r>
           </w:p>
         </w:tc>
@@ -1045,34 +994,14 @@
                 <w:sz w:val="22"/>
                 <w:szCs w:val="22"/>
               </w:rPr>
-              <w:t>11</w:t>
-            </w:r>
-            <w:r>
-              <w:rPr>
-                <w:sz w:val="22"/>
-                <w:szCs w:val="22"/>
-              </w:rPr>
-              <w:t>–</w:t>
-            </w:r>
-            <w:r>
-              <w:rPr>
-                <w:sz w:val="22"/>
-                <w:szCs w:val="22"/>
-              </w:rPr>
-              <w:t>31</w:t>
-            </w:r>
-            <w:r>
-              <w:rPr>
-                <w:sz w:val="22"/>
-                <w:szCs w:val="22"/>
-              </w:rPr>
-              <w:t xml:space="preserve"> Jul 2027 </w:t>
+              <w:t xml:space="preserve">Summer 2027 (21 days)</w:t>
             </w:r>
           </w:p>
         </w:tc>
         <w:tc>
           <w:tcPr>
             <w:tcW w:w="1710" w:type="dxa"/>
+            <w:vMerge w:val="restart"/>
             <w:vAlign w:val="center"/>
           </w:tcPr>
           <w:p>
@@ -1089,7 +1018,7 @@
                 <w:sz w:val="22"/>
                 <w:szCs w:val="22"/>
               </w:rPr>
-              <w:t>$6,700</w:t>
+              <w:t xml:space="preserve">$6,700</w:t>
             </w:r>
           </w:p>
         </w:tc>
@@ -1117,7 +1046,7 @@
                 <w:sz w:val="22"/>
                 <w:szCs w:val="22"/>
               </w:rPr>
-              <w:t>Conference, Priority 1</w:t>
+              <w:t xml:space="preserve">AIAD, Alternate 1</w:t>
             </w:r>
           </w:p>
         </w:tc>
@@ -1140,7 +1069,7 @@
                 <w:sz w:val="22"/>
                 <w:szCs w:val="22"/>
               </w:rPr>
-              <w:t>SCSP AI+ Expo and hackathon</w:t>
+              <w:t xml:space="preserve">MIT Lincoln Laboratory</w:t>
             </w:r>
           </w:p>
         </w:tc>
@@ -1163,7 +1092,7 @@
                 <w:sz w:val="22"/>
                 <w:szCs w:val="22"/>
               </w:rPr>
-              <w:t>Washington, DC</w:t>
+              <w:t xml:space="preserve">Lexington, MA</w:t>
             </w:r>
           </w:p>
         </w:tc>
@@ -1186,13 +1115,14 @@
                 <w:sz w:val="22"/>
                 <w:szCs w:val="22"/>
               </w:rPr>
-              <w:t>24–25 May 2027</w:t>
+              <w:t xml:space="preserve">11–31 Jul 2027</w:t>
             </w:r>
           </w:p>
         </w:tc>
         <w:tc>
           <w:tcPr>
             <w:tcW w:w="1710" w:type="dxa"/>
+            <w:vMerge/>
             <w:vAlign w:val="center"/>
           </w:tcPr>
           <w:p>
@@ -1204,12 +1134,240 @@
                 <w:szCs w:val="22"/>
               </w:rPr>
             </w:pPr>
+          </w:p>
+        </w:tc>
+      </w:tr>
+      <w:tr>
+        <w:trPr>
+          <w:cantSplit/>
+        </w:trPr>
+        <w:tc>
+          <w:tcPr>
+            <w:tcW w:w="2137" w:type="dxa"/>
+            <w:vAlign w:val="center"/>
+          </w:tcPr>
+          <w:p>
+            <w:pPr>
+              <w:keepNext/>
+              <w:jc w:val="center"/>
+              <w:rPr>
+                <w:sz w:val="22"/>
+                <w:szCs w:val="22"/>
+              </w:rPr>
+            </w:pPr>
             <w:r>
               <w:rPr>
                 <w:sz w:val="22"/>
                 <w:szCs w:val="22"/>
               </w:rPr>
-              <w:t>$2,000</w:t>
+              <w:t xml:space="preserve">AIAD, Alternate 2</w:t>
+            </w:r>
+          </w:p>
+        </w:tc>
+        <w:tc>
+          <w:tcPr>
+            <w:tcW w:w="1980" w:type="dxa"/>
+            <w:vAlign w:val="center"/>
+          </w:tcPr>
+          <w:p>
+            <w:pPr>
+              <w:keepNext/>
+              <w:jc w:val="center"/>
+              <w:rPr>
+                <w:sz w:val="22"/>
+                <w:szCs w:val="22"/>
+              </w:rPr>
+            </w:pPr>
+            <w:r>
+              <w:rPr>
+                <w:sz w:val="22"/>
+                <w:szCs w:val="22"/>
+              </w:rPr>
+              <w:t xml:space="preserve">Duke University ECE</w:t>
+            </w:r>
+          </w:p>
+        </w:tc>
+        <w:tc>
+          <w:tcPr>
+            <w:tcW w:w="1890" w:type="dxa"/>
+            <w:vAlign w:val="center"/>
+          </w:tcPr>
+          <w:p>
+            <w:pPr>
+              <w:keepNext/>
+              <w:jc w:val="center"/>
+              <w:rPr>
+                <w:sz w:val="22"/>
+                <w:szCs w:val="22"/>
+              </w:rPr>
+            </w:pPr>
+            <w:r>
+              <w:rPr>
+                <w:sz w:val="22"/>
+                <w:szCs w:val="22"/>
+              </w:rPr>
+              <w:t xml:space="preserve">Durham, NC</w:t>
+            </w:r>
+          </w:p>
+        </w:tc>
+        <w:tc>
+          <w:tcPr>
+            <w:tcW w:w="1530" w:type="dxa"/>
+            <w:vAlign w:val="center"/>
+          </w:tcPr>
+          <w:p>
+            <w:pPr>
+              <w:keepNext/>
+              <w:jc w:val="center"/>
+              <w:rPr>
+                <w:sz w:val="22"/>
+                <w:szCs w:val="22"/>
+              </w:rPr>
+            </w:pPr>
+            <w:r>
+              <w:rPr>
+                <w:sz w:val="22"/>
+                <w:szCs w:val="22"/>
+              </w:rPr>
+              <w:t xml:space="preserve">Summer 2027 (21 days)</w:t>
+            </w:r>
+          </w:p>
+        </w:tc>
+        <w:tc>
+          <w:tcPr>
+            <w:tcW w:w="1710" w:type="dxa"/>
+            <w:vMerge/>
+            <w:vAlign w:val="center"/>
+          </w:tcPr>
+          <w:p>
+            <w:pPr>
+              <w:keepNext/>
+              <w:jc w:val="center"/>
+              <w:rPr>
+                <w:sz w:val="22"/>
+                <w:szCs w:val="22"/>
+              </w:rPr>
+            </w:pPr>
+          </w:p>
+        </w:tc>
+      </w:tr>
+      <w:tr>
+        <w:trPr>
+          <w:cantSplit/>
+        </w:trPr>
+        <w:tc>
+          <w:tcPr>
+            <w:tcW w:w="2137" w:type="dxa"/>
+            <w:vAlign w:val="center"/>
+          </w:tcPr>
+          <w:p>
+            <w:pPr>
+              <w:keepNext/>
+              <w:jc w:val="center"/>
+              <w:rPr>
+                <w:sz w:val="22"/>
+                <w:szCs w:val="22"/>
+              </w:rPr>
+            </w:pPr>
+            <w:r>
+              <w:rPr>
+                <w:sz w:val="22"/>
+                <w:szCs w:val="22"/>
+              </w:rPr>
+              <w:t xml:space="preserve">Conference, Primary</w:t>
+            </w:r>
+          </w:p>
+        </w:tc>
+        <w:tc>
+          <w:tcPr>
+            <w:tcW w:w="1980" w:type="dxa"/>
+            <w:vAlign w:val="center"/>
+          </w:tcPr>
+          <w:p>
+            <w:pPr>
+              <w:keepNext/>
+              <w:jc w:val="center"/>
+              <w:rPr>
+                <w:sz w:val="22"/>
+                <w:szCs w:val="22"/>
+              </w:rPr>
+            </w:pPr>
+            <w:r>
+              <w:rPr>
+                <w:sz w:val="22"/>
+                <w:szCs w:val="22"/>
+              </w:rPr>
+              <w:t xml:space="preserve">SCSP AI+ Expo and hackathon</w:t>
+            </w:r>
+          </w:p>
+        </w:tc>
+        <w:tc>
+          <w:tcPr>
+            <w:tcW w:w="1890" w:type="dxa"/>
+            <w:vAlign w:val="center"/>
+          </w:tcPr>
+          <w:p>
+            <w:pPr>
+              <w:keepNext/>
+              <w:jc w:val="center"/>
+              <w:rPr>
+                <w:sz w:val="22"/>
+                <w:szCs w:val="22"/>
+              </w:rPr>
+            </w:pPr>
+            <w:r>
+              <w:rPr>
+                <w:sz w:val="22"/>
+                <w:szCs w:val="22"/>
+              </w:rPr>
+              <w:t xml:space="preserve">Washington, DC</w:t>
+            </w:r>
+          </w:p>
+        </w:tc>
+        <w:tc>
+          <w:tcPr>
+            <w:tcW w:w="1530" w:type="dxa"/>
+            <w:vAlign w:val="center"/>
+          </w:tcPr>
+          <w:p>
+            <w:pPr>
+              <w:keepNext/>
+              <w:jc w:val="center"/>
+              <w:rPr>
+                <w:sz w:val="22"/>
+                <w:szCs w:val="22"/>
+              </w:rPr>
+            </w:pPr>
+            <w:r>
+              <w:rPr>
+                <w:sz w:val="22"/>
+                <w:szCs w:val="22"/>
+              </w:rPr>
+              <w:t xml:space="preserve">24–25 May 2027</w:t>
+            </w:r>
+          </w:p>
+        </w:tc>
+        <w:tc>
+          <w:tcPr>
+            <w:tcW w:w="1710" w:type="dxa"/>
+            <w:vMerge w:val="restart"/>
+            <w:vAlign w:val="center"/>
+          </w:tcPr>
+          <w:p>
+            <w:pPr>
+              <w:keepNext/>
+              <w:jc w:val="center"/>
+              <w:rPr>
+                <w:sz w:val="22"/>
+                <w:szCs w:val="22"/>
+              </w:rPr>
+            </w:pPr>
+            <w:r>
+              <w:rPr>
+                <w:sz w:val="22"/>
+                <w:szCs w:val="22"/>
+              </w:rPr>
+              <w:t xml:space="preserve">$2,000</w:t>
             </w:r>
           </w:p>
         </w:tc>
@@ -1237,7 +1395,7 @@
                 <w:sz w:val="22"/>
                 <w:szCs w:val="22"/>
               </w:rPr>
-              <w:t>Conference, Priority 2 (alternate)</w:t>
+              <w:t xml:space="preserve">Conference, Alternate 1</w:t>
             </w:r>
           </w:p>
         </w:tc>
@@ -1260,7 +1418,7 @@
                 <w:sz w:val="22"/>
                 <w:szCs w:val="22"/>
               </w:rPr>
-              <w:t>IEEE SIEDS, UVA</w:t>
+              <w:t xml:space="preserve">IEEE SIEDS, UVA</w:t>
             </w:r>
           </w:p>
         </w:tc>
@@ -1283,7 +1441,7 @@
                 <w:sz w:val="22"/>
                 <w:szCs w:val="22"/>
               </w:rPr>
-              <w:t>Charlottesville, VA</w:t>
+              <w:t xml:space="preserve">Charlottesville, VA</w:t>
             </w:r>
           </w:p>
         </w:tc>
@@ -1306,13 +1464,14 @@
                 <w:sz w:val="22"/>
                 <w:szCs w:val="22"/>
               </w:rPr>
-              <w:t>Early May 2027</w:t>
+              <w:t xml:space="preserve">Early May 2027</w:t>
             </w:r>
           </w:p>
         </w:tc>
         <w:tc>
           <w:tcPr>
             <w:tcW w:w="1710" w:type="dxa"/>
+            <w:vMerge/>
             <w:vAlign w:val="center"/>
           </w:tcPr>
           <w:p>
@@ -1324,13 +1483,6 @@
                 <w:szCs w:val="22"/>
               </w:rPr>
             </w:pPr>
-            <w:r>
-              <w:rPr>
-                <w:sz w:val="22"/>
-                <w:szCs w:val="22"/>
-              </w:rPr>
-              <w:t>$2,000</w:t>
-            </w:r>
           </w:p>
         </w:tc>
       </w:tr>
@@ -1345,6 +1497,7 @@
           </w:tcPr>
           <w:p>
             <w:pPr>
+              <w:keepNext/>
               <w:jc w:val="center"/>
               <w:rPr>
                 <w:sz w:val="22"/>
@@ -1356,7 +1509,7 @@
                 <w:sz w:val="22"/>
                 <w:szCs w:val="22"/>
               </w:rPr>
-              <w:t>Conference, Priority 3 (alternate)</w:t>
+              <w:t xml:space="preserve">Conference, Alternate 2</w:t>
             </w:r>
           </w:p>
         </w:tc>
@@ -1367,6 +1520,7 @@
           </w:tcPr>
           <w:p>
             <w:pPr>
+              <w:keepNext/>
               <w:jc w:val="center"/>
               <w:rPr>
                 <w:sz w:val="22"/>
@@ -1378,7 +1532,7 @@
                 <w:sz w:val="22"/>
                 <w:szCs w:val="22"/>
               </w:rPr>
-              <w:t>AUSA Global Force Symposium</w:t>
+              <w:t xml:space="preserve">AUSA Global Force Symposium</w:t>
             </w:r>
           </w:p>
         </w:tc>
@@ -1389,6 +1543,7 @@
           </w:tcPr>
           <w:p>
             <w:pPr>
+              <w:keepNext/>
               <w:jc w:val="center"/>
               <w:rPr>
                 <w:sz w:val="22"/>
@@ -1400,7 +1555,7 @@
                 <w:sz w:val="22"/>
                 <w:szCs w:val="22"/>
               </w:rPr>
-              <w:t>Huntsville, AL</w:t>
+              <w:t xml:space="preserve">Huntsville, AL</w:t>
             </w:r>
           </w:p>
         </w:tc>
@@ -1411,6 +1566,7 @@
           </w:tcPr>
           <w:p>
             <w:pPr>
+              <w:keepNext/>
               <w:jc w:val="center"/>
               <w:rPr>
                 <w:sz w:val="22"/>
@@ -1422,30 +1578,25 @@
                 <w:sz w:val="22"/>
                 <w:szCs w:val="22"/>
               </w:rPr>
-              <w:t>16–18 Mar 2027</w:t>
+              <w:t xml:space="preserve">16–18 Mar 2027</w:t>
             </w:r>
           </w:p>
         </w:tc>
         <w:tc>
           <w:tcPr>
             <w:tcW w:w="1710" w:type="dxa"/>
+            <w:vMerge/>
             <w:vAlign w:val="center"/>
           </w:tcPr>
           <w:p>
             <w:pPr>
+              <w:keepNext/>
               <w:jc w:val="center"/>
               <w:rPr>
                 <w:sz w:val="22"/>
                 <w:szCs w:val="22"/>
               </w:rPr>
             </w:pPr>
-            <w:r>
-              <w:rPr>
-                <w:sz w:val="22"/>
-                <w:szCs w:val="22"/>
-              </w:rPr>
-              <w:t>$2,000</w:t>
-            </w:r>
           </w:p>
         </w:tc>
       </w:tr>
@@ -1519,7 +1670,7 @@
           <w:sz w:val="24"/>
           <w:szCs w:val="24"/>
         </w:rPr>
-        <w:t xml:space="preserve">Total. $9,497 (AIAD $6,700, first-priority conference $2,000, online courses $797), within the $10,000 limit. Each alternate conference is also $2,000.</w:t>
+        <w:t xml:space="preserve">Total. $9,497 (one AIAD $6,700, one conference $2,000, online courses $797), within the $10,000 limit.</w:t>
       </w:r>
     </w:p>
     <w:p>
@@ -1554,7 +1705,7 @@
           <w:sz w:val="24"/>
           <w:szCs w:val="24"/>
         </w:rPr>
-        <w:t xml:space="preserve">Timeline for Expenditures. From November 2026 to February 2027, I will request the AIAD placement, submit the SIEDS abstract, and register for the conferences. I will attend the funded conference between March and May 2027 and complete the AIAD from 11–31 July 2027. I will buy each MITx certificate when that course opens, and all funds will be spent by 31 December 2027, before my May 2029 graduation.</w:t>
+        <w:t xml:space="preserve">Timeline for Expenditures. From November 2026 to February 2027, I will request my AIAD choices in priority order, submit the SIEDS abstract, and register for the conferences. I will attend the funded conference between March and May 2027 and complete the AIAD in summer 2027. I will buy each MITx certificate when that course opens, and all funds will be spent by 31 December 2027, before my May 2029 graduation.</w:t>
       </w:r>
     </w:p>
     <w:p>

</xml_diff>

<commit_message>
Memo and CV: add how the Taiwan model is scored, LTC Bosworth, AIAD vs fellowship, confirmed months
Co-Authored-By: Claude Opus 5.5 <noreply@anthropic.com>
Claude-Session: https://claude.ai/code/session_01HUa9sxRc7o7bsnuzSz3H5S
</commit_message>
<xml_diff>
--- a/application/Pezan_DXDT_Application_Memo.docx
+++ b/application/Pezan_DXDT_Application_Memo.docx
@@ -329,7 +329,7 @@
           <w:sz w:val="24"/>
           <w:szCs w:val="24"/>
         </w:rPr>
-        <w:t xml:space="preserve">2. Purpose. Mr. Philippone has described data as the ammunition of the future and has framed a commander’s hardest choices as constrained optimization, which means finding the best decision across competing tradeoffs fast enough to matter. This past summer I saw that idea from three angles. On the Sea to Shining Sea AIAD, Palantir’s team in Palo Alto walked us through Project Maven and how it gives commanders at every echelon a common picture to decide from. At the 4th Infantry Division, we saw how a formation employs those systems and feeds lessons back to the developers. At Stanford’s Gordian Knot Center, Col. (Ret.) Joseph Felter and Jack Faherty described how student startups get new technology into the hands of Army units, and why that is so difficult.</w:t>
+        <w:t xml:space="preserve">2. Purpose. Mr. Philippone has described data as the ammunition of the future and has framed a commander’s hardest choices as constrained optimization, which means finding the best decision across competing tradeoffs fast enough to matter. This past June, on the Sea to Shining Sea Domestic AIAD, a summer program separate from the fellowship I hold during the academic year, I saw that idea from several angles. Palantir’s team in Palo Alto walked us through Project Maven and how it gives commanders at every echelon a common picture to decide from, and the 4th Infantry Division showed us how a formation employs those systems and feeds lessons back to the developers. At Stanford’s Gordian Knot Center, Col. (Ret.) Joseph Felter and Jack Faherty described how student startups get new technology into the hands of Army units, and why that is so difficult. At Meta, we met with LTC Andrew Bosworth, Meta’s chief technology officer and an Army Reserve officer in Detachment 201, which brings technology executives into the Army.</w:t>
       </w:r>
     </w:p>
     <w:p>
@@ -417,7 +417,7 @@
           <w:sz w:val="24"/>
           <w:szCs w:val="24"/>
         </w:rPr>
-        <w:t xml:space="preserve">That question became my current project with my advisor, LTC Matthew Webb, whose doctoral research was in transportation and logistics. My project asks where an adversary with a fixed effort budget should act to cut Taiwan’s crude oil supply. Additionally, it tests whether LTC Webb’s reinforcement-learning attacker, trained on Ukraine’s rail network, still finds strong strategies on sea lanes. I built a 57-node, 79-edge model of Taiwan’s crude import routes from open sources, with sourced capacities and seven costed adversary actions, and verified it against an independent max-flow calculation.</w:t>
+        <w:t xml:space="preserve">That question became my current project with my advisor, LTC Matthew Webb, whose doctoral research was in transportation and logistics. My project asks where an adversary with a fixed effort budget should act to cut Taiwan’s crude oil supply. Additionally, it tests whether LTC Webb’s reinforcement-learning attacker, trained on Ukraine’s rail network, still finds strong strategies on sea lanes. I built a 57-node, 79-edge model of Taiwan’s crude import routes from open sources, with sourced capacities and seven costed adversary actions, and verified it against an independent max-flow calculation. I score each plan by the share of Taiwan’s crude demand that still arrives after the adversary spends its budget, averaged over whether each action succeeds and with Taiwan rerouting supply, so a lower score is a better plan for the adversary.</w:t>
       </w:r>
     </w:p>
     <w:p>
@@ -446,7 +446,7 @@
           <w:sz w:val="24"/>
           <w:szCs w:val="24"/>
         </w:rPr>
-        <w:t xml:space="preserve">My near-term goal is to finish this study. Over the coming year I will (1) compare optimization baselines against the trained agent, (2) run wargaming scenarios that vary blockade and cyber costs to see how the adversary’s best plan changes, and (3) report whether a rail-trained attacker transfers to a maritime network. I will present the results at Projects Day and, if accepted, at SIEDS. In my remaining years at West Point, I want to extend the model from attacking a network to defending one, deciding where added capacity or protection keeps supply flowing, and develop that work into a senior thesis.</w:t>
+        <w:t xml:space="preserve">My near-term goal is to finish this study. Over the coming year I will (1) test whether the trained agent beats random plans, which leave Taiwan about 90% of its demand, and a greedy baseline, which leaves 70%, and comes close to an exact solver while answering in seconds rather than hours, (2) run six wargaming scenarios, from the base case to lower and higher action costs, higher and lower demand, and a closed Strait of Hormuz, to see how the adversary’s best plan changes, and (3) report whether a rail-trained attacker transfers to a maritime network. I will present the results at Projects Day and, if accepted, at SIEDS. In my remaining years at West Point, I want to extend the model from attacking a network to defending one, deciding where added capacity or protection keeps supply flowing, and develop that work into a senior thesis.</w:t>
       </w:r>
     </w:p>
     <w:p>

</xml_diff>

<commit_message>
CV, resume, memo: official AIAD name, CLDSTEM name and WPLCS, degree wording, COL (Ret.), resume synced
Co-Authored-By: Claude Opus 5.5 <noreply@anthropic.com>
Claude-Session: https://claude.ai/code/session_01HUa9sxRc7o7bsnuzSz3H5S
</commit_message>
<xml_diff>
--- a/application/Pezan_DXDT_Application_Memo.docx
+++ b/application/Pezan_DXDT_Application_Memo.docx
@@ -300,7 +300,7 @@
           <w:sz w:val="24"/>
           <w:szCs w:val="24"/>
         </w:rPr>
-        <w:t>1.  Long-term Professional Goals.  I intend to serve as an Army officer who turns operational problems into rigorous models and fielded software. I plan to commission as an Infantry officer and lead Soldiers first, because I believe many crucial problems start within formations. As an Operations Research major with a minor in artificial intelligence and a finance specialization, I then want to build toward service as an Operations Research/Systems Analyst (FA49) or work with AI through the Army AI Integration Center (AI2C) or the GenAI Task Force. Additionally, I plan to earn a graduate degree, such as an MBA or another qualifying degree, and return to West Point to teach in the Department of Mathematical Sciences, bringing current industry practice into the classroom.</w:t>
+        <w:t xml:space="preserve">1.  Long-term Professional Goals.  I intend to serve as an Army officer who turns operational problems into rigorous models and fielded software. I plan to commission as an Infantry officer and lead Soldiers first, because I believe many crucial problems start within formations. As an Operations Research major with a minor in artificial intelligence and a finance specialization, I then want to build toward service as an Operations Research/Systems Analyst (FA49) or work with AI through the Army AI Integration Center (AI2C) or the GenAI Task Force. Additionally, I plan to earn a graduate degree that qualifies me to return to West Point and teach in the Department of Mathematical Sciences, bringing current industry practice into the classroom, and eventually an MBA.</w:t>
       </w:r>
     </w:p>
     <w:p>
@@ -329,7 +329,7 @@
           <w:sz w:val="24"/>
           <w:szCs w:val="24"/>
         </w:rPr>
-        <w:t xml:space="preserve">2. Purpose. Mr. Philippone has described data as the ammunition of the future and has framed a commander’s hardest choices as constrained optimization, which means finding the best decision across competing tradeoffs fast enough to matter. This past June, on the Sea to Shining Sea Domestic AIAD, a summer program separate from the fellowship I hold during the academic year, I saw that idea from several angles. Palantir’s team in Palo Alto walked us through Project Maven and how it gives commanders at every echelon a common picture to decide from, and the 4th Infantry Division showed us how a formation employs those systems and feeds lessons back to the developers. At Stanford’s Gordian Knot Center, Col. (Ret.) Joseph Felter and Jack Faherty described how student startups get new technology into the hands of Army units, and why that is so difficult. At Meta, we met with LTC Andrew Bosworth, Meta’s chief technology officer and an Army Reserve officer in Detachment 201, which brings technology executives into the Army.</w:t>
+        <w:t xml:space="preserve">2. Purpose. Mr. Philippone has described data as the ammunition of the future and has framed a commander’s hardest choices as constrained optimization, which means finding the best decision across competing tradeoffs fast enough to matter. This past June, on the Technology and Innovation AIAD through the Department of Social Sciences, separate from the Sea to Shining Sea Fellowship I hold during the academic year, I saw that idea from several angles. Palantir’s team in Palo Alto walked us through Project Maven and how it gives commanders at every echelon a common picture to decide from, and the 4th Infantry Division showed us how a formation employs those systems and feeds lessons back to the developers. At Stanford’s Gordian Knot Center, COL (Ret.) Joseph Felter and Jack Faherty described how student startups get new technology into the hands of Army units, and why that is so difficult. At Meta, we met with LTC Andrew Bosworth, Meta’s chief technology officer and an Army Reserve officer in Detachment 201, which brings technology executives into the Army.</w:t>
       </w:r>
     </w:p>
     <w:p>
@@ -446,7 +446,7 @@
           <w:sz w:val="24"/>
           <w:szCs w:val="24"/>
         </w:rPr>
-        <w:t xml:space="preserve">My near-term goal is to finish this study. Over the coming year I will (1) test whether the trained agent beats random plans, which leave Taiwan about 90% of its demand, and a greedy baseline, which leaves 70%, and comes close to an exact solver while answering in seconds rather than hours, (2) run six wargaming scenarios, from the base case to lower and higher action costs, higher and lower demand, and a closed Strait of Hormuz, to see how the adversary’s best plan changes, and (3) report whether a rail-trained attacker transfers to a maritime network. I will present the results at Projects Day and, if accepted, at SIEDS. In my remaining years at West Point, I want to extend the model from attacking a network to defending one, deciding where added capacity or protection keeps supply flowing, and develop that work into a senior thesis.</w:t>
+        <w:t xml:space="preserve">My near-term goal is to finish this study. Over the coming year I will (1) test whether the trained agent beats random plans, which leave Taiwan about 90% of its demand, and a greedy baseline, which leaves 70%, and comes close to an exact solver while answering in seconds rather than hours, (2) run six wargaming scenarios, from the base case to lower and higher action costs, higher and lower demand, and a closed Strait of Hormuz, to see how the adversary’s best plan changes, and (3) report whether a rail-trained attacker transfers to a maritime network. I will present the results at Projects Day and, if accepted, at SIEDS. In my remaining years at West Point, I want to extend the model from attacking a network to defending one, deciding where added capacity or protection keeps supply flowing.</w:t>
       </w:r>
     </w:p>
     <w:p>

</xml_diff>